<commit_message>
fix: GLM final numbers after dead-letter recovery - SR F1 0.8829 (994/5), cross-provider kappa 0.8483 (0.8233-0.8733, n=998); manuscript tables/abstract updated
</commit_message>
<xml_diff>
--- a/docs/paper/metawingman-methodology-manuscript.docx
+++ b/docs/paper/metawingman-methodology-manuscript.docx
@@ -144,7 +144,7 @@
         <w:t xml:space="preserve"> </w:t>
       </w:r>
       <w:r>
-        <w:t xml:space="preserve">Section-role classification reached macro-F1 0.9995 and evidence retrieval MRR 0.962 (P@1 0.933). Open-set retrieval favored BM25 single-stage (MRR 0.2649) over trained rerankers, which hurt two-stage performance. A deterministic R pipeline reproduced a published random-effects meta-analysis (pooled MD 2.865 vs 2.9; I² 92.67% vs 93%) in three locked runs. A first AI-only screening pilot on 649 frozen records achieved gold recall 0.765 (114/149), with abstention the dominant loss. Cross-provider agreement reached kappa 0.8723.</w:t>
+        <w:t xml:space="preserve">Section-role classification reached macro-F1 0.9995 and evidence retrieval MRR 0.962 (P@1 0.933). Open-set retrieval favored BM25 single-stage (MRR 0.2649) over trained rerankers, which hurt two-stage performance. A deterministic R pipeline reproduced a published random-effects meta-analysis (pooled MD 2.865 vs 2.9; I² 92.67% vs 93%) in three locked runs. A first AI-only screening pilot on 649 frozen records achieved gold recall 0.765 (114/149), with abstention the dominant loss. Cross-provider agreement reached kappa 0.8483.</w:t>
       </w:r>
     </w:p>
     <w:p>
@@ -472,7 +472,7 @@
         <w:t xml:space="preserve">0.765，弃权为主要损失；跨提供方一致性</w:t>
       </w:r>
       <w:r>
-        <w:t xml:space="preserve"> kappa 0.8723。</w:t>
+        <w:t xml:space="preserve"> kappa 0.8483。</w:t>
       </w:r>
     </w:p>
     <w:p>
@@ -1428,7 +1428,7 @@
         <w:t xml:space="preserve">docs/architecture/glm-cross-provider-results-2026-08-18.md</w:t>
       </w:r>
       <w:r>
-        <w:t xml:space="preserve">). Section-role macro-F1 was 0.9003 for GLM versus 0.9385 for DeepSeek; retrieval selection accuracy was 0.96 versus 0.93; and across providers, Cohen’s kappa on the shared 927 scored passages was 0.8723 (95% CI 0.8483 to 0.8964), interpreted as substantial to almost-perfect agreement [16]. These numbers indicate that the two providers largely agree on section-role assignment, which supports provider diversity for verification roles without claiming that either model is correct where both agree. The certificate double-judge smoke test (DeepSeek 4.0 and GLM 4.4) ran blind with audit, quality-scores, and gate fields stripped and agreement measured by Pearson correlation (evidence:</w:t>
+        <w:t xml:space="preserve">). Section-role macro-F1 was 0.8829 for GLM (994 scored, 5 abstained after two dead-letter recovery rounds; the dominant dead-letter cause was reasoning-token budget exhaustion) versus 0.9385 for DeepSeek; retrieval selection accuracy was 0.96 versus 0.93; and across providers, Cohen’s kappa on the shared 998 scored passages was 0.8483 (95% CI 0.8233 to 0.8733), interpreted as substantial to almost-perfect agreement [16]. These numbers indicate that the two providers largely agree on section-role assignment, which supports provider diversity for verification roles without claiming that either model is correct where both agree. The certificate double-judge smoke test (DeepSeek 4.0 and GLM 4.4) ran blind with audit, quality-scores, and gate fields stripped and agreement measured by Pearson correlation (evidence:</w:t>
       </w:r>
       <w:r>
         <w:t xml:space="preserve"> </w:t>
@@ -1448,7 +1448,7 @@
         <w:pStyle w:val="BodyText"/>
       </w:pPr>
       <w:r>
-        <w:t xml:space="preserve">Provider diversity is a verification strategy, not a truth oracle. If two independent providers assign the same section role to the same passage, the assignment is more likely to be right than either model alone, but two models can share the same systematic error, and the kappa of 0.8723 does not measure correctness against any reference. The point of the comparison is narrower: the system can run its verification roles on two providers and expect them to agree most of the time, which makes cross-provider double-checking a usable mechanism rather than a source of constant disagreement. The per-metric differences (0.9003 versus 0.9385 on section-role; 0.96 versus 0.93 on retrieval selection) are also a reminder that provider choice moves component performance by a few points, which matters when a component sits at a decision boundary.</w:t>
+        <w:t xml:space="preserve">Provider diversity is a verification strategy, not a truth oracle. If two independent providers assign the same section role to the same passage, the assignment is more likely to be right than either model alone, but two models can share the same systematic error, and the kappa of 0.8483 does not measure correctness against any reference. The point of the comparison is narrower: the system can run its verification roles on two providers and expect them to agree most of the time, which makes cross-provider double-checking a usable mechanism rather than a source of constant disagreement. The per-metric differences (0.8829 versus 0.9385 on section-role; 0.96 versus 0.93 on retrieval selection) are also a reminder that provider choice moves component performance by a few points, which matters when a component sits at a decision boundary.</w:t>
       </w:r>
     </w:p>
     <w:bookmarkEnd w:id="29"/>
@@ -1633,7 +1633,7 @@
         <w:pStyle w:val="BodyText"/>
       </w:pPr>
       <w:r>
-        <w:t xml:space="preserve">The limitations are substantial and we state them explicitly. (1) All component metrics measure consistency with rule-based or rubric-grounded labels; none of them measures scientific validity against an independent human reference standard beyond the VAL-3 pilot’s gold set. The rubric V2 macro-F1 of 0.3777 alongside weighted-F1 0.871, and the 98%-majority-class distribution of the relabeled data, both limit what macro-averaged scores can tell us. (2) The criterion-level kappa 0.311 documents a rule-vs-guideline mismatch that was repaired by relabeling but not independently re-verified against human judges; the kappa itself has a wide confidence interval (0.191 to 0.431) reflecting evaluation-process variance on a 100-item sample. (3) The reconstruction case is a recomputation within the same statistical engine family; it validates pipeline mechanics, not model capability, and generalizes only as far as metafor-compatible analyses. (4) The VAL-3 pilot is a single AI-only screening run on 649 frozen records with an abstention-heavy profile (gold recall 0.765, retention 19.4%); equivalence with dual independent human screening is not established, and the abstention loss (17.4% of gold) is the main barrier to recall. (5) The abstract-level extraction coverage (sensitivity 17.4%) shows that screening and extraction cannot rely on abstracts, and the full-text retrieval stage required by the pipeline was not part of the numbers reported here. (6) An AI-only end-to-end review, from certificate to published-numbers reconstruction under one protocol, remains unfinished; what we report is a validated assembly of components plus one locked reconstruction slice. (7) Cross-provider agreement (kappa 0.8723) is measured on a single 999-paragraph set with one model per provider; it supports provider diversity as a verification mechanism but says nothing about absolute correctness. (8) The evaluation processes themselves are not yet independently replicated: the VAL-2c kappa, the cross-provider kappa, and the judge correlations each rest on one evaluation run, and the confidence intervals reported for the kappas quantify sampling variance, not replication stability.</w:t>
+        <w:t xml:space="preserve">The limitations are substantial and we state them explicitly. (1) All component metrics measure consistency with rule-based or rubric-grounded labels; none of them measures scientific validity against an independent human reference standard beyond the VAL-3 pilot’s gold set. The rubric V2 macro-F1 of 0.3777 alongside weighted-F1 0.871, and the 98%-majority-class distribution of the relabeled data, both limit what macro-averaged scores can tell us. (2) The criterion-level kappa 0.311 documents a rule-vs-guideline mismatch that was repaired by relabeling but not independently re-verified against human judges; the kappa itself has a wide confidence interval (0.191 to 0.431) reflecting evaluation-process variance on a 100-item sample. (3) The reconstruction case is a recomputation within the same statistical engine family; it validates pipeline mechanics, not model capability, and generalizes only as far as metafor-compatible analyses. (4) The VAL-3 pilot is a single AI-only screening run on 649 frozen records with an abstention-heavy profile (gold recall 0.765, retention 19.4%); equivalence with dual independent human screening is not established, and the abstention loss (17.4% of gold) is the main barrier to recall. (5) The abstract-level extraction coverage (sensitivity 17.4%) shows that screening and extraction cannot rely on abstracts, and the full-text retrieval stage required by the pipeline was not part of the numbers reported here. (6) An AI-only end-to-end review, from certificate to published-numbers reconstruction under one protocol, remains unfinished; what we report is a validated assembly of components plus one locked reconstruction slice. (7) Cross-provider agreement (kappa 0.8483) is measured on a single 999-paragraph set with one model per provider; it supports provider diversity as a verification mechanism but says nothing about absolute correctness. (8) The evaluation processes themselves are not yet independently replicated: the VAL-2c kappa, the cross-provider kappa, and the judge correlations each rest on one evaluation run, and the confidence intervals reported for the kappas quantify sampling variance, not replication stability.</w:t>
       </w:r>
     </w:p>
     <w:p>
@@ -3210,7 +3210,7 @@
               <w:pStyle w:val="Compact"/>
             </w:pPr>
             <w:r>
-              <w:t xml:space="preserve">0.9003</w:t>
+              <w:t xml:space="preserve">0.8829</w:t>
             </w:r>
           </w:p>
         </w:tc>
@@ -3280,7 +3280,7 @@
               <w:pStyle w:val="Compact"/>
             </w:pPr>
             <w:r>
-              <w:t xml:space="preserve">Cohen’s kappa on shared 927 scored passages</w:t>
+              <w:t xml:space="preserve">Cohen’s kappa on shared 998 scored passages</w:t>
             </w:r>
           </w:p>
         </w:tc>
@@ -3313,7 +3313,7 @@
               <w:pStyle w:val="Compact"/>
             </w:pPr>
             <w:r>
-              <w:t xml:space="preserve">0.8723 (95% CI 0.8483 to 0.8964)</w:t>
+              <w:t xml:space="preserve">0.8483 (95% CI 0.8233 to 0.8733)</w:t>
             </w:r>
           </w:p>
         </w:tc>

</xml_diff>

<commit_message>
paper: re-render manuscript formats with GLM final numbers (0.8816/0.8472)
</commit_message>
<xml_diff>
--- a/docs/paper/metawingman-methodology-manuscript.docx
+++ b/docs/paper/metawingman-methodology-manuscript.docx
@@ -144,7 +144,7 @@
         <w:t xml:space="preserve"> </w:t>
       </w:r>
       <w:r>
-        <w:t xml:space="preserve">Section-role classification reached macro-F1 0.9995 and evidence retrieval MRR 0.962 (P@1 0.933). Open-set retrieval favored BM25 single-stage (MRR 0.2649) over trained rerankers, which hurt two-stage performance. A deterministic R pipeline reproduced a published random-effects meta-analysis (pooled MD 2.865 vs 2.9; I² 92.67% vs 93%) in three locked runs. A first AI-only screening pilot on 649 frozen records achieved gold recall 0.765 (114/149), with abstention the dominant loss. Cross-provider agreement reached kappa 0.8483.</w:t>
+        <w:t xml:space="preserve">Section-role classification reached macro-F1 0.9995 and evidence retrieval MRR 0.962 (P@1 0.933). Open-set retrieval favored BM25 single-stage (MRR 0.2649) over trained rerankers, which hurt two-stage performance. A deterministic R pipeline reproduced a published random-effects meta-analysis (pooled MD 2.865 vs 2.9; I² 92.67% vs 93%) in three locked runs. A first AI-only screening pilot on 649 frozen records achieved gold recall 0.765 (114/149), with abstention the dominant loss. Cross-provider agreement reached kappa 0.8472.</w:t>
       </w:r>
     </w:p>
     <w:p>
@@ -472,7 +472,7 @@
         <w:t xml:space="preserve">0.765，弃权为主要损失；跨提供方一致性</w:t>
       </w:r>
       <w:r>
-        <w:t xml:space="preserve"> kappa 0.8483。</w:t>
+        <w:t xml:space="preserve"> kappa 0.8472。</w:t>
       </w:r>
     </w:p>
     <w:p>
@@ -1428,7 +1428,7 @@
         <w:t xml:space="preserve">docs/architecture/glm-cross-provider-results-2026-08-18.md</w:t>
       </w:r>
       <w:r>
-        <w:t xml:space="preserve">). Section-role macro-F1 was 0.8829 for GLM (994 scored, 5 abstained after two dead-letter recovery rounds; the dominant dead-letter cause was reasoning-token budget exhaustion) versus 0.9385 for DeepSeek; retrieval selection accuracy was 0.96 versus 0.93; and across providers, Cohen’s kappa on the shared 998 scored passages was 0.8483 (95% CI 0.8233 to 0.8733), interpreted as substantial to almost-perfect agreement [16]. These numbers indicate that the two providers largely agree on section-role assignment, which supports provider diversity for verification roles without claiming that either model is correct where both agree. The certificate double-judge smoke test (DeepSeek 4.0 and GLM 4.4) ran blind with audit, quality-scores, and gate fields stripped and agreement measured by Pearson correlation (evidence:</w:t>
+        <w:t xml:space="preserve">). Section-role macro-F1 was 0.8816 for GLM (999 scored, 0 abstained after three dead-letter recovery rounds; the dominant dead-letter cause was reasoning-token budget exhaustion, all recovered) versus 0.9385 for DeepSeek; retrieval selection accuracy was 0.96 versus 0.93; and across providers, Cohen’s kappa on the shared 999 scored passages was 0.8472 (95% CI 0.8221 to 0.8722), interpreted as substantial to almost-perfect agreement [16]. These numbers indicate that the two providers largely agree on section-role assignment, which supports provider diversity for verification roles without claiming that either model is correct where both agree. The certificate double-judge smoke test (DeepSeek 4.0 and GLM 4.4) ran blind with audit, quality-scores, and gate fields stripped and agreement measured by Pearson correlation (evidence:</w:t>
       </w:r>
       <w:r>
         <w:t xml:space="preserve"> </w:t>
@@ -1448,7 +1448,7 @@
         <w:pStyle w:val="BodyText"/>
       </w:pPr>
       <w:r>
-        <w:t xml:space="preserve">Provider diversity is a verification strategy, not a truth oracle. If two independent providers assign the same section role to the same passage, the assignment is more likely to be right than either model alone, but two models can share the same systematic error, and the kappa of 0.8483 does not measure correctness against any reference. The point of the comparison is narrower: the system can run its verification roles on two providers and expect them to agree most of the time, which makes cross-provider double-checking a usable mechanism rather than a source of constant disagreement. The per-metric differences (0.8829 versus 0.9385 on section-role; 0.96 versus 0.93 on retrieval selection) are also a reminder that provider choice moves component performance by a few points, which matters when a component sits at a decision boundary.</w:t>
+        <w:t xml:space="preserve">Provider diversity is a verification strategy, not a truth oracle. If two independent providers assign the same section role to the same passage, the assignment is more likely to be right than either model alone, but two models can share the same systematic error, and the kappa of 0.8472 does not measure correctness against any reference. The point of the comparison is narrower: the system can run its verification roles on two providers and expect them to agree most of the time, which makes cross-provider double-checking a usable mechanism rather than a source of constant disagreement. The per-metric differences (0.8816 versus 0.9385 on section-role; 0.96 versus 0.93 on retrieval selection) are also a reminder that provider choice moves component performance by a few points, which matters when a component sits at a decision boundary.</w:t>
       </w:r>
     </w:p>
     <w:bookmarkEnd w:id="29"/>
@@ -1633,7 +1633,7 @@
         <w:pStyle w:val="BodyText"/>
       </w:pPr>
       <w:r>
-        <w:t xml:space="preserve">The limitations are substantial and we state them explicitly. (1) All component metrics measure consistency with rule-based or rubric-grounded labels; none of them measures scientific validity against an independent human reference standard beyond the VAL-3 pilot’s gold set. The rubric V2 macro-F1 of 0.3777 alongside weighted-F1 0.871, and the 98%-majority-class distribution of the relabeled data, both limit what macro-averaged scores can tell us. (2) The criterion-level kappa 0.311 documents a rule-vs-guideline mismatch that was repaired by relabeling but not independently re-verified against human judges; the kappa itself has a wide confidence interval (0.191 to 0.431) reflecting evaluation-process variance on a 100-item sample. (3) The reconstruction case is a recomputation within the same statistical engine family; it validates pipeline mechanics, not model capability, and generalizes only as far as metafor-compatible analyses. (4) The VAL-3 pilot is a single AI-only screening run on 649 frozen records with an abstention-heavy profile (gold recall 0.765, retention 19.4%); equivalence with dual independent human screening is not established, and the abstention loss (17.4% of gold) is the main barrier to recall. (5) The abstract-level extraction coverage (sensitivity 17.4%) shows that screening and extraction cannot rely on abstracts, and the full-text retrieval stage required by the pipeline was not part of the numbers reported here. (6) An AI-only end-to-end review, from certificate to published-numbers reconstruction under one protocol, remains unfinished; what we report is a validated assembly of components plus one locked reconstruction slice. (7) Cross-provider agreement (kappa 0.8483) is measured on a single 999-paragraph set with one model per provider; it supports provider diversity as a verification mechanism but says nothing about absolute correctness. (8) The evaluation processes themselves are not yet independently replicated: the VAL-2c kappa, the cross-provider kappa, and the judge correlations each rest on one evaluation run, and the confidence intervals reported for the kappas quantify sampling variance, not replication stability.</w:t>
+        <w:t xml:space="preserve">The limitations are substantial and we state them explicitly. (1) All component metrics measure consistency with rule-based or rubric-grounded labels; none of them measures scientific validity against an independent human reference standard beyond the VAL-3 pilot’s gold set. The rubric V2 macro-F1 of 0.3777 alongside weighted-F1 0.871, and the 98%-majority-class distribution of the relabeled data, both limit what macro-averaged scores can tell us. (2) The criterion-level kappa 0.311 documents a rule-vs-guideline mismatch that was repaired by relabeling but not independently re-verified against human judges; the kappa itself has a wide confidence interval (0.191 to 0.431) reflecting evaluation-process variance on a 100-item sample. (3) The reconstruction case is a recomputation within the same statistical engine family; it validates pipeline mechanics, not model capability, and generalizes only as far as metafor-compatible analyses. (4) The VAL-3 pilot is a single AI-only screening run on 649 frozen records with an abstention-heavy profile (gold recall 0.765, retention 19.4%); equivalence with dual independent human screening is not established, and the abstention loss (17.4% of gold) is the main barrier to recall. (5) The abstract-level extraction coverage (sensitivity 17.4%) shows that screening and extraction cannot rely on abstracts, and the full-text retrieval stage required by the pipeline was not part of the numbers reported here. (6) An AI-only end-to-end review, from certificate to published-numbers reconstruction under one protocol, remains unfinished; what we report is a validated assembly of components plus one locked reconstruction slice. (7) Cross-provider agreement (kappa 0.8472) is measured on a single 999-paragraph set with one model per provider; it supports provider diversity as a verification mechanism but says nothing about absolute correctness. (8) The evaluation processes themselves are not yet independently replicated: the VAL-2c kappa, the cross-provider kappa, and the judge correlations each rest on one evaluation run, and the confidence intervals reported for the kappas quantify sampling variance, not replication stability.</w:t>
       </w:r>
     </w:p>
     <w:p>
@@ -3210,7 +3210,7 @@
               <w:pStyle w:val="Compact"/>
             </w:pPr>
             <w:r>
-              <w:t xml:space="preserve">0.8829</w:t>
+              <w:t xml:space="preserve">0.8816</w:t>
             </w:r>
           </w:p>
         </w:tc>
@@ -3280,7 +3280,7 @@
               <w:pStyle w:val="Compact"/>
             </w:pPr>
             <w:r>
-              <w:t xml:space="preserve">Cohen’s kappa on shared 998 scored passages</w:t>
+              <w:t xml:space="preserve">Cohen’s kappa on shared 999 scored passages</w:t>
             </w:r>
           </w:p>
         </w:tc>
@@ -3313,7 +3313,7 @@
               <w:pStyle w:val="Compact"/>
             </w:pPr>
             <w:r>
-              <w:t xml:space="preserve">0.8483 (95% CI 0.8233 to 0.8733)</w:t>
+              <w:t xml:space="preserve">0.8472 (95% CI 0.8221 to 0.8722)</w:t>
             </w:r>
           </w:p>
         </w:tc>

</xml_diff>

<commit_message>
paper: single author Fangshenyi (full CRediT), minimal AI-use disclosure, affiliation placeholder; re-render
</commit_message>
<xml_diff>
--- a/docs/paper/metawingman-methodology-manuscript.docx
+++ b/docs/paper/metawingman-methodology-manuscript.docx
@@ -20,6 +20,40 @@
           <w:b/>
           <w:bCs/>
         </w:rPr>
+        <w:t xml:space="preserve">Author:</w:t>
+      </w:r>
+      <w:r>
+        <w:t xml:space="preserve"> </w:t>
+      </w:r>
+      <w:r>
+        <w:t xml:space="preserve">Fangshenyi</w:t>
+      </w:r>
+      <w:r>
+        <w:t xml:space="preserve"> </w:t>
+      </w:r>
+      <w:r>
+        <w:rPr>
+          <w:b/>
+          <w:bCs/>
+        </w:rPr>
+        <w:t xml:space="preserve">Affiliation:</w:t>
+      </w:r>
+      <w:r>
+        <w:t xml:space="preserve"> </w:t>
+      </w:r>
+      <w:r>
+        <w:t xml:space="preserve">[to be confirmed at submission]</w:t>
+      </w:r>
+    </w:p>
+    <w:p>
+      <w:pPr>
+        <w:pStyle w:val="BodyText"/>
+      </w:pPr>
+      <w:r>
+        <w:rPr>
+          <w:b/>
+          <w:bCs/>
+        </w:rPr>
         <w:t xml:space="preserve">Manuscript type:</w:t>
       </w:r>
       <w:r>
@@ -1978,7 +2012,7 @@
         <w:pStyle w:val="FirstParagraph"/>
       </w:pPr>
       <w:r>
-        <w:t xml:space="preserve">[Placeholder author list; to be completed by the author team.] Conceptualization: [Author A]; Methodology: [Author A], [Author B]; Software: [Author A], [Author B]; Validation: [Author A], [Author B]; Formal analysis: [Author B]; Data curation: [Author B]; Writing (original draft): [Author A]; Writing (review and editing): [Author A], [Author B]; Project administration: [Author A].</w:t>
+        <w:t xml:space="preserve">Fangshenyi: Conceptualization, Methodology, Software, Validation, Formal analysis, Investigation, Data curation, Writing (original draft), Writing (review and editing), Visualization, Supervision, Project administration.</w:t>
       </w:r>
     </w:p>
     <w:bookmarkEnd w:id="37"/>
@@ -2032,7 +2066,7 @@
         <w:pStyle w:val="FirstParagraph"/>
       </w:pPr>
       <w:r>
-        <w:t xml:space="preserve">This manuscript was drafted with AI assistance and verified against the project’s evidence dossiers and execution receipts. All reported numbers originate from machine execution receipts or versioned result documents generated by the MetaWingman pipeline; no number was generated during manuscript writing. The draft follows a prespecified evidence dossier, and each figure was checked against its cited receipt. The ten-stage checklist gate and audit-log discipline of the project were applied to the manuscript itself.</w:t>
+        <w:t xml:space="preserve">Generative AI tools assisted with drafting portions of this manuscript. The author reviewed and verified the content and takes full responsibility for the work.</w:t>
       </w:r>
     </w:p>
     <w:p>

</xml_diff>